<commit_message>
feat(auth): unify sign-in and route accounts by identity
</commit_message>
<xml_diff>
--- a/docs/deliverables/下午班-08组-WEMOVE-SPORTS-测试报告-v0.7.docx
+++ b/docs/deliverables/下午班-08组-WEMOVE-SPORTS-测试报告-v0.7.docx
@@ -1179,10 +1179,7 @@
               <w:spacing w:line="276" w:lineRule="auto" w:after="20"/>
             </w:pPr>
             <w:r>
-              <w:rPr>
-                <w:sz w:val="19"/>
-              </w:rPr>
-              <w:t>/customer/login</w:t>
+              <w:t>/login</w:t>
             </w:r>
           </w:p>
         </w:tc>
@@ -1279,10 +1276,7 @@
               <w:jc w:val="center"/>
             </w:pPr>
             <w:r>
-              <w:rPr>
-                <w:sz w:val="19"/>
-              </w:rPr>
-              <w:t>/dealer/login</w:t>
+              <w:t>/login</w:t>
             </w:r>
           </w:p>
         </w:tc>
@@ -1379,10 +1373,7 @@
               <w:jc w:val="center"/>
             </w:pPr>
             <w:r>
-              <w:rPr>
-                <w:sz w:val="19"/>
-              </w:rPr>
-              <w:t>/admin/login</w:t>
+              <w:t>/login</w:t>
             </w:r>
           </w:p>
         </w:tc>
@@ -1395,7 +1386,67 @@
     </w:p>
     <w:p>
       <w:r>
-        <w:t>以上为新库 seed 默认测试凭据，已按用户要求明确列出。消费者和经销商登录、管理员密码进入 MFA challenge 已在本机实际核对。管理员仍需首次绑定验证器，并在登录和敏感操作输入当前六位动态码；不能用固定验证码代替 MFA。旧库重新 seed 不重置已有密码。上述凭据不用于生产。</w:t>
+        <w:t xml:space="preserve">三类测试账号统一使用 </w:t>
+      </w:r>
+      <w:r>
+        <w:rPr>
+          <w:rFonts w:ascii="Consolas" w:hAnsi="Consolas"/>
+          <w:sz w:val="18"/>
+        </w:rPr>
+        <w:t>http://localhost:3000/login</w:t>
+      </w:r>
+      <w:r>
+        <w:t>（HTTPS：</w:t>
+      </w:r>
+      <w:r>
+        <w:rPr>
+          <w:rFonts w:ascii="Consolas" w:hAnsi="Consolas"/>
+          <w:sz w:val="18"/>
+        </w:rPr>
+        <w:t>https://127.0.0.1:3443/login</w:t>
+      </w:r>
+      <w:r>
+        <w:t>）；原三入口兼容跳转，按身份进入账户中心、企业目录或后台。经销商按要求完成条款或 MFA；员工须绑定验证器并验证当前六位动态码。凭据仅用于测试，旧库 seed 不重置密码。</w:t>
+      </w:r>
+    </w:p>
+    <w:p>
+      <w:r>
+        <w:t>统一登录回归检查：干净暂存快照的 API lint、类型检查、构建及 Web 类型检查、</w:t>
+      </w:r>
+      <w:r>
+        <w:rPr>
+          <w:rFonts w:ascii="Consolas" w:hAnsi="Consolas"/>
+          <w:sz w:val="18"/>
+        </w:rPr>
+        <w:t>--webpack</w:t>
+      </w:r>
+      <w:r>
+        <w:t xml:space="preserve"> 生产构建通过；API 25 文件、129 项测试通过，含新增 19 项统一登录单测。浏览器使用原工作区生产构建与本机开发库 </w:t>
+      </w:r>
+      <w:r>
+        <w:rPr>
+          <w:rFonts w:ascii="Consolas" w:hAnsi="Consolas"/>
+          <w:sz w:val="18"/>
+        </w:rPr>
+        <w:t>wemove</w:t>
+      </w:r>
+      <w:r>
+        <w:t>：Chromium 统一登录 4 项、采购与购物各 1 项通过，WebKit 统一登录 4 项通过。</w:t>
+      </w:r>
+    </w:p>
+    <w:p>
+      <w:r>
+        <w:t xml:space="preserve">Firefox 本机启动报 </w:t>
+      </w:r>
+      <w:r>
+        <w:rPr>
+          <w:rFonts w:ascii="Consolas" w:hAnsi="Consolas"/>
+          <w:sz w:val="18"/>
+        </w:rPr>
+        <w:t>spawn UNKNOWN</w:t>
+      </w:r>
+      <w:r>
+        <w:t>，3 项浏览器用例未执行，待 Linux CI 核验。本轮仅记录上述本机结果，历史 CI #54 与 CI #51 的证据来源及统计不变。</w:t>
       </w:r>
     </w:p>
     <w:p>
@@ -4079,7 +4130,7 @@
     <w:rsid w:val="00FC693F"/>
     <w:pPr>
       <w:widowControl/>
-      <w:spacing w:line="307" w:lineRule="auto" w:after="120"/>
+      <w:spacing w:line="288" w:lineRule="auto" w:after="60"/>
     </w:pPr>
     <w:rPr>
       <w:rFonts w:ascii="Calibri" w:hAnsi="Calibri" w:eastAsia="宋体"/>

</xml_diff>